<commit_message>
Add Novikom treasury portfolio and 10y market track to Sber invest CV
Cover letter and resume now include Novikom online treasury book analysis, stocks/futures/bonds, and current probability/statistics courses.
</commit_message>
<xml_diff>
--- a/Abramov_DN_resume_SBER_invest.docx
+++ b/Abramov_DN_resume_SBER_invest.docx
@@ -223,7 +223,7 @@
           <w:color w:val="222222"/>
           <w:sz w:val="21"/>
         </w:rPr>
-        <w:t>Считаю и проверяю модели на данных Московской биржи, затем упаковываю вывод так, чтобы им можно было пользоваться: порог, риск позиции, что делать дальше. Параллельно 10 лет в Сбере готовил цифры и слайды для комитетов и руководства.</w:t>
+        <w:t>Больше 10 лет на рынке своими руками: акции, фьючерсы, облигации. Россия и зарубеж. И активная торговля, и инвестиции. Считаю и проверяю модели, затем упаковываю вывод для решения: порог, риск позиции, что делать дальше.</w:t>
       </w:r>
     </w:p>
     <w:p>
@@ -237,7 +237,7 @@
           <w:color w:val="222222"/>
           <w:sz w:val="21"/>
         </w:rPr>
-        <w:t>С 2024 веду собственное исследование парного спреда TATN/TATNP: живые котировки с MOEX ISS, z-score, прогон на истории, сверка с боевой торговлей, заявки через API Т-Инвестиций. Считаю на Python (pandas). Ищу роль, где этот контур - работа, а не хобби.</w:t>
+        <w:t>В банке Новиком делал онлайн-анализ рыночного портфеля казначейства. С 2024 веду исследование парного спреда TATN/TATNP на MOEX: ISS, z-score, история, сверка с живой торговлей, API Т-Инвестиций, Python (pandas). В Сбере 10 лет готовил цифры и слайды для комитетов. Сейчас для себя прохожу курсы по теории вероятностей и матстатистике.</w:t>
       </w:r>
     </w:p>
     <w:p>
@@ -251,7 +251,65 @@
           <w:color w:val="1F3A5F"/>
           <w:sz w:val="26"/>
         </w:rPr>
-        <w:t>Проект под задачу вакансии</w:t>
+        <w:t>Проекты под задачу вакансии</w:t>
+      </w:r>
+    </w:p>
+    <w:p>
+      <w:pPr>
+        <w:spacing w:before="200" w:after="0" w:line="240" w:lineRule="auto"/>
+      </w:pPr>
+      <w:r>
+        <w:rPr>
+          <w:rFonts w:ascii="Arial" w:hAnsi="Arial" w:eastAsia="Arial" w:cs="Arial"/>
+          <w:b w:val="0"/>
+          <w:color w:val="555555"/>
+          <w:sz w:val="20"/>
+        </w:rPr>
+        <w:t>Проект</w:t>
+      </w:r>
+    </w:p>
+    <w:p>
+      <w:pPr>
+        <w:spacing w:before="40" w:after="0" w:line="240" w:lineRule="auto"/>
+      </w:pPr>
+      <w:r>
+        <w:rPr>
+          <w:rFonts w:ascii="Arial" w:hAnsi="Arial" w:eastAsia="Arial" w:cs="Arial"/>
+          <w:b/>
+          <w:color w:val="1F3A5F"/>
+          <w:sz w:val="22"/>
+        </w:rPr>
+        <w:t>Банк Новиком</w:t>
+      </w:r>
+    </w:p>
+    <w:p>
+      <w:pPr>
+        <w:spacing w:before="80" w:after="80" w:line="240" w:lineRule="auto"/>
+      </w:pPr>
+      <w:r>
+        <w:rPr>
+          <w:rFonts w:ascii="Arial" w:hAnsi="Arial" w:eastAsia="Arial" w:cs="Arial"/>
+          <w:b/>
+          <w:color w:val="222222"/>
+          <w:sz w:val="21"/>
+        </w:rPr>
+        <w:t>Онлайн-анализ рыночного портфеля казначейства</w:t>
+      </w:r>
+    </w:p>
+    <w:p>
+      <w:pPr>
+        <w:pStyle w:val="ListBullet"/>
+        <w:spacing w:before="0" w:after="40" w:line="240" w:lineRule="auto"/>
+        <w:ind w:left="360"/>
+      </w:pPr>
+      <w:r>
+        <w:rPr>
+          <w:rFonts w:ascii="Arial" w:hAnsi="Arial" w:eastAsia="Arial" w:cs="Arial"/>
+          <w:b w:val="0"/>
+          <w:color w:val="222222"/>
+          <w:sz w:val="20"/>
+        </w:rPr>
+        <w:t>Онлайн-анализ рыночного портфеля казначейства: мониторинг позиций и цифры для решения в моменте, не отчёт после факта.</w:t>
       </w:r>
     </w:p>
     <w:p>
@@ -1241,7 +1299,7 @@
           <w:color w:val="222222"/>
           <w:sz w:val="20"/>
         </w:rPr>
-        <w:t>Московская биржа  ·  Акции и спреды  ·  Z-score / пороги  ·  Тест на истории  ·  Сверка с живым рынком  ·  MOEX ISS  ·  API брокера  ·  Python (pandas)  ·  SQL  ·  Методология показателя  ·  ТЗ для разработки  ·  Приёмка алгоритма  ·  Презентации для комитетов  ·  QlikView / Qlik Sense  ·  Excel  ·  PowerPoint</w:t>
+        <w:t>Московская биржа  ·  Акции  ·  Фьючерсы  ·  Облигации  ·  Российский и международный рынок  ·  Активная торговля и инвестиции  ·  Z-score / пороги  ·  Тест на истории  ·  MOEX ISS  ·  API брокера  ·  Python (pandas)  ·  SQL  ·  Теория вероятностей / матстатистика (курсы)  ·  ТЗ для разработки  ·  Презентации для комитетов  ·  QlikView / Qlik Sense  ·  Excel  ·  PowerPoint</w:t>
       </w:r>
     </w:p>
     <w:p>
@@ -1311,7 +1369,7 @@
           <w:color w:val="222222"/>
           <w:sz w:val="21"/>
         </w:rPr>
-        <w:t>Готов разобрать на собеседовании TATN/TATNP: формула спреда, выбор порога, почему тест и прод расходятся, как отсекаю отчётные дни. VaR, облигации и деривативы в промышленном контуре не считал - это зона роста, не текущий опыт.</w:t>
+        <w:t>Готов разобрать TATN/TATNP и логику онлайн-анализа портфеля казначейства в Новикоме. Промышленный VaR по книге - зона роста, не текущий ежедневный инструмент. Сейчас усиливаю теорию вероятностей и матстатистику курсами.</w:t>
       </w:r>
     </w:p>
     <w:sectPr>

</xml_diff>

<commit_message>
Frame market strategy work as a lived practice, not a side hobby
Opening of the Sber invest CV and cover letter now states the research loop is self-driven: idea, calculation, history, live check, rule rewrite.
</commit_message>
<xml_diff>
--- a/Abramov_DN_resume_SBER_invest.docx
+++ b/Abramov_DN_resume_SBER_invest.docx
@@ -223,7 +223,7 @@
           <w:color w:val="222222"/>
           <w:sz w:val="21"/>
         </w:rPr>
-        <w:t>Больше 10 лет на рынке своими руками: акции, фьючерсы, облигации. Россия и зарубеж. И активная торговля, и инвестиции. Считаю и проверяю модели, затем упаковываю вывод для решения: порог, риск позиции, что делать дальше.</w:t>
+        <w:t>Рынок, разбор и сборка стратегий - не хобби после работы. Этим живу сам, без задачи от работодателя: идея, расчёт, проверка на истории, сверка с живым рынком, снова правка правила. Так больше 10 лет: акции, фьючерсы, облигации, Россия и зарубеж. И активная торговля, и инвестиции.</w:t>
       </w:r>
     </w:p>
     <w:p>
@@ -237,7 +237,7 @@
           <w:color w:val="222222"/>
           <w:sz w:val="21"/>
         </w:rPr>
-        <w:t>В банке Новиком делал онлайн-анализ рыночного портфеля казначейства. С 2024 веду исследование парного спреда TATN/TATNP на MOEX: ISS, z-score, история, сверка с живой торговлей, API Т-Инвестиций, Python (pandas). В Сбере 10 лет готовил цифры и слайды для комитетов. Сейчас для себя прохожу курсы по теории вероятностей и матстатистике.</w:t>
+        <w:t>В Новикоме делал онлайн-анализ рыночного портфеля казначейства. С 2024 собрал рабочий контур по TATN/TATNP на MOEX: ISS, z-score, история, сверка с живой торговлей, API Т-Инвестиций, Python (pandas). В Сбере 10 лет готовил цифры и слайды для комитетов. Сейчас усиливаю теорию вероятностей и матстатистику курсами.</w:t>
       </w:r>
     </w:p>
     <w:p>
@@ -337,7 +337,7 @@
           <w:color w:val="222222"/>
           <w:sz w:val="21"/>
         </w:rPr>
-        <w:t>Собственное исследование: парный спред TATN/TATNP на Московской бирже</w:t>
+        <w:t>Своя линия: разработка и проверка стратегий (TATN/TATNP, Московская биржа)</w:t>
       </w:r>
     </w:p>
     <w:p>
@@ -1369,7 +1369,7 @@
           <w:color w:val="222222"/>
           <w:sz w:val="21"/>
         </w:rPr>
-        <w:t>Готов разобрать TATN/TATNP и логику онлайн-анализа портфеля казначейства в Новикоме. Промышленный VaR по книге - зона роста, не текущий ежедневный инструмент. Сейчас усиливаю теорию вероятностей и матстатистику курсами.</w:t>
+        <w:t>Готов на встрече разобрать, как собираю стратегию: от идеи до правила, истории и живого рынка. Новиком и TATN/TATNP - два рабочих примера. Промышленный VaR по книге готов нарастить в команде.</w:t>
       </w:r>
     </w:p>
     <w:sectPr>

</xml_diff>

<commit_message>
Rewrite Sber invest About section around product, corp, IT
Map the vacancy: own TATN desk, committee slides, TZ to development.
Leave the cover letter untouched.
</commit_message>
<xml_diff>
--- a/Abramov_DN_resume_SBER_invest.docx
+++ b/Abramov_DN_resume_SBER_invest.docx
@@ -223,7 +223,21 @@
           <w:color w:val="222222"/>
           <w:sz w:val="21"/>
         </w:rPr>
-        <w:t>Рынок, разбор и сборка стратегий - не хобби после работы. Этим живу сам, без задачи от работодателя: идея, расчёт, проверка на истории, сверка с живым рынком, снова правка правила. Так больше 10 лет: акции, фьючерсы, облигации, Россия и зарубеж. И активная торговля, и инвестиции.</w:t>
+        <w:t>Собрал собственный продукт для торговли и аналитики на Московской бирже: TATN/TATNP, котировки ISS, z-score, спреды, пороги, прогон на истории, сверка с живым рынком, журнал сделок, API брокера, Python (pandas). Веду его сам: идея, расчёт, проверка, правка правил. Рынок больше 10 лет: акции, фьючерсы, облигации, Россия и зарубеж. В Новикоме делал онлайн-анализ рыночного портфеля казначейства - позиции и риск в моменте.</w:t>
+      </w:r>
+    </w:p>
+    <w:p>
+      <w:pPr>
+        <w:spacing w:before="0" w:after="80" w:line="240" w:lineRule="auto"/>
+      </w:pPr>
+      <w:r>
+        <w:rPr>
+          <w:rFonts w:ascii="Arial" w:hAnsi="Arial" w:eastAsia="Arial" w:cs="Arial"/>
+          <w:b w:val="0"/>
+          <w:color w:val="222222"/>
+          <w:sz w:val="21"/>
+        </w:rPr>
+        <w:t>Сильный корпоративный опыт в Сбере, Axenix и ПСБ. В Сбере 10 лет готовил материалы для управляющих комитетов и Правления: собрать данные, выстроить структуру, уложить цифру в слайд, который читают без формул. В Axenix вёл команду до 15 человек и дашборды для высшего руководства НЛМК. Сейчас в ПСБ собираю хранилище и подключаю BI.</w:t>
       </w:r>
     </w:p>
     <w:p>
@@ -237,7 +251,7 @@
           <w:color w:val="222222"/>
           <w:sz w:val="21"/>
         </w:rPr>
-        <w:t>В Новикоме делал онлайн-анализ рыночного портфеля казначейства. С 2024 собрал рабочий контур по TATN/TATNP на MOEX: ISS, z-score, история, сверка с живой торговлей, API Т-Инвестиций, Python (pandas). В Сбере 10 лет готовил цифры и слайды для комитетов. Сейчас усиливаю теорию вероятностей и матстатистику курсами.</w:t>
+        <w:t>ИТ - рабочий контур, не теория: SQL, Python, постановка ТЗ разработке, приёмка алгоритма на истории. Модель довожу до экрана, которым пользуюсь сам. Теорию вероятностей и матстатистику отдельно усиливаю курсами.</w:t>
       </w:r>
     </w:p>
     <w:p>

</xml_diff>

<commit_message>
Tighten Sber invest About section to two paragraphs
Keep product, committees, IT and stats; drop only the extra lead-in.
</commit_message>
<xml_diff>
--- a/Abramov_DN_resume_SBER_invest.docx
+++ b/Abramov_DN_resume_SBER_invest.docx
@@ -228,20 +228,6 @@
     </w:p>
     <w:p>
       <w:pPr>
-        <w:spacing w:before="0" w:after="80" w:line="240" w:lineRule="auto"/>
-      </w:pPr>
-      <w:r>
-        <w:rPr>
-          <w:rFonts w:ascii="Arial" w:hAnsi="Arial" w:eastAsia="Arial" w:cs="Arial"/>
-          <w:b w:val="0"/>
-          <w:color w:val="222222"/>
-          <w:sz w:val="21"/>
-        </w:rPr>
-        <w:t>Сильный корпоративный опыт в Сбере, Axenix и ПСБ. В Сбере 10 лет готовил материалы для управляющих комитетов и Правления: собрать данные, выстроить структуру, уложить цифру в слайд, который читают без формул. В Axenix вёл команду до 15 человек и дашборды для высшего руководства НЛМК. Сейчас в ПСБ собираю хранилище и подключаю BI.</w:t>
-      </w:r>
-    </w:p>
-    <w:p>
-      <w:pPr>
         <w:spacing w:before="0" w:after="160" w:line="240" w:lineRule="auto"/>
       </w:pPr>
       <w:r>
@@ -251,7 +237,7 @@
           <w:color w:val="222222"/>
           <w:sz w:val="21"/>
         </w:rPr>
-        <w:t>ИТ - рабочий контур, не теория: SQL, Python, постановка ТЗ разработке, приёмка алгоритма на истории. Модель довожу до экрана, которым пользуюсь сам. Теорию вероятностей и матстатистику отдельно усиливаю курсами.</w:t>
+        <w:t>В Сбере 10 лет готовил материалы для управляющих комитетов и Правления: собрать данные, выстроить структуру, уложить цифру в слайд без формул. В Axenix вёл команду до 15 человек и дашборды для высшего руководства НЛМК. Сейчас в ПСБ собираю хранилище и подключаю BI. ИТ - рабочий контур: SQL, Python, постановка ТЗ разработке, приёмка алгоритма на истории, модель довожу до экрана. Теорию вероятностей и матстатистику отдельно усиливаю курсами.</w:t>
       </w:r>
     </w:p>
     <w:p>

</xml_diff>

<commit_message>
Apply user's Sber invest resume structure
About plus key corp bullets, cleaned project lines, fuller PSB block.
Drop VaR disclaimer and duplicate CI phrasing.
</commit_message>
<xml_diff>
--- a/Abramov_DN_resume_SBER_invest.docx
+++ b/Abramov_DN_resume_SBER_invest.docx
@@ -214,7 +214,7 @@
     </w:p>
     <w:p>
       <w:pPr>
-        <w:spacing w:before="0" w:after="80" w:line="240" w:lineRule="auto"/>
+        <w:spacing w:before="0" w:after="120" w:line="240" w:lineRule="auto"/>
       </w:pPr>
       <w:r>
         <w:rPr>
@@ -228,16 +228,80 @@
     </w:p>
     <w:p>
       <w:pPr>
-        <w:spacing w:before="0" w:after="160" w:line="240" w:lineRule="auto"/>
+        <w:spacing w:before="80" w:after="40" w:line="240" w:lineRule="auto"/>
+      </w:pPr>
+      <w:r>
+        <w:rPr>
+          <w:rFonts w:ascii="Arial" w:hAnsi="Arial" w:eastAsia="Arial" w:cs="Arial"/>
+          <w:b/>
+          <w:color w:val="222222"/>
+          <w:sz w:val="20"/>
+        </w:rPr>
+        <w:t>Ключевой корпоративный опыт</w:t>
+      </w:r>
+    </w:p>
+    <w:p>
+      <w:pPr>
+        <w:pStyle w:val="ListBullet"/>
+        <w:spacing w:before="0" w:after="40" w:line="240" w:lineRule="auto"/>
+        <w:ind w:left="360"/>
       </w:pPr>
       <w:r>
         <w:rPr>
           <w:rFonts w:ascii="Arial" w:hAnsi="Arial" w:eastAsia="Arial" w:cs="Arial"/>
           <w:b w:val="0"/>
           <w:color w:val="222222"/>
-          <w:sz w:val="21"/>
+          <w:sz w:val="20"/>
         </w:rPr>
-        <w:t>В Сбере 10 лет готовил материалы для управляющих комитетов и Правления: собрать данные, выстроить структуру, уложить цифру в слайд без формул. В Axenix вёл команду до 15 человек и дашборды для высшего руководства НЛМК. Сейчас в ПСБ собираю хранилище и подключаю BI. ИТ - рабочий контур: SQL, Python, постановка ТЗ разработке, приёмка алгоритма на истории, модель довожу до экрана. Теорию вероятностей и матстатистику отдельно усиливаю курсами.</w:t>
+        <w:t>В Сбере 10 лет готовил материалы для управляющих комитетов и Правления: собрать данные, выстроить структуру, уложить цифру в слайд без формул.</w:t>
+      </w:r>
+    </w:p>
+    <w:p>
+      <w:pPr>
+        <w:pStyle w:val="ListBullet"/>
+        <w:spacing w:before="0" w:after="40" w:line="240" w:lineRule="auto"/>
+        <w:ind w:left="360"/>
+      </w:pPr>
+      <w:r>
+        <w:rPr>
+          <w:rFonts w:ascii="Arial" w:hAnsi="Arial" w:eastAsia="Arial" w:cs="Arial"/>
+          <w:b w:val="0"/>
+          <w:color w:val="222222"/>
+          <w:sz w:val="20"/>
+        </w:rPr>
+        <w:t>В Axenix вёл команду до 15 человек и дашборды для высшего руководства НЛМК.</w:t>
+      </w:r>
+    </w:p>
+    <w:p>
+      <w:pPr>
+        <w:pStyle w:val="ListBullet"/>
+        <w:spacing w:before="0" w:after="40" w:line="240" w:lineRule="auto"/>
+        <w:ind w:left="360"/>
+      </w:pPr>
+      <w:r>
+        <w:rPr>
+          <w:rFonts w:ascii="Arial" w:hAnsi="Arial" w:eastAsia="Arial" w:cs="Arial"/>
+          <w:b w:val="0"/>
+          <w:color w:val="222222"/>
+          <w:sz w:val="20"/>
+        </w:rPr>
+        <w:t>Сейчас в ПСБ собираю хранилище и подключаю BI.</w:t>
+      </w:r>
+    </w:p>
+    <w:p>
+      <w:pPr>
+        <w:pStyle w:val="ListBullet"/>
+        <w:spacing w:before="0" w:after="40" w:line="240" w:lineRule="auto"/>
+        <w:ind w:left="360"/>
+      </w:pPr>
+      <w:r>
+        <w:rPr>
+          <w:rFonts w:ascii="Arial" w:hAnsi="Arial" w:eastAsia="Arial" w:cs="Arial"/>
+          <w:b w:val="0"/>
+          <w:color w:val="222222"/>
+          <w:sz w:val="20"/>
+        </w:rPr>
+        <w:t>ИТ - рабочий контур: SQL, Python, постановка ТЗ разработке, приёмка алгоритма на истории, модель довожу до экрана. Теорию вероятностей и матстатистику отдельно усиливаю курсами.</w:t>
       </w:r>
     </w:p>
     <w:p>
@@ -251,7 +315,7 @@
           <w:color w:val="1F3A5F"/>
           <w:sz w:val="26"/>
         </w:rPr>
-        <w:t>Проекты под задачу вакансии</w:t>
+        <w:t>Проекты</w:t>
       </w:r>
     </w:p>
     <w:p>
@@ -309,7 +373,7 @@
           <w:color w:val="222222"/>
           <w:sz w:val="20"/>
         </w:rPr>
-        <w:t>Онлайн-анализ рыночного портфеля казначейства: мониторинг позиций и цифры для решения в моменте, не отчёт после факта.</w:t>
+        <w:t>Мониторинг позиций и цифры для решения в моменте, не отчёт после факта.</w:t>
       </w:r>
     </w:p>
     <w:p>
@@ -337,7 +401,7 @@
           <w:color w:val="222222"/>
           <w:sz w:val="21"/>
         </w:rPr>
-        <w:t>Своя линия: разработка и проверка стратегий (TATN/TATNP, Московская биржа)</w:t>
+        <w:t>Своя линия: разработка и проверка стратегий (Московская биржа)</w:t>
       </w:r>
     </w:p>
     <w:p>
@@ -369,7 +433,7 @@
           <w:color w:val="222222"/>
           <w:sz w:val="20"/>
         </w:rPr>
-        <w:t>Сверяю тест и живой рынок: где расходится, где модель врёт, какие дни (в т.ч. отчётность TATN) выбивают статистику.</w:t>
+        <w:t>Сверяю тест и живой рынок: где расходится, какие дни (отчётность, корп. события) влияют на статистику.</w:t>
       </w:r>
     </w:p>
     <w:p>
@@ -385,7 +449,7 @@
           <w:color w:val="222222"/>
           <w:sz w:val="20"/>
         </w:rPr>
-        <w:t>Мониторю акции и спред в течение сессии. Исполнение через API брокера (Т-Инвестиции): постановка и контроль заявок по ногам.</w:t>
+        <w:t>Исполнение через API брокера (Т-Инвестиции): постановка и контроль заявок.</w:t>
       </w:r>
     </w:p>
     <w:p>
@@ -401,7 +465,7 @@
           <w:color w:val="222222"/>
           <w:sz w:val="20"/>
         </w:rPr>
-        <w:t>Python (pandas) - загрузка рядов, расчёты, кэш баров ISS. ТЗ на доработку алгоритма, проверка результата на истории.</w:t>
+        <w:t>Python (pandas) - загрузка рядов, расчёты, кэш баров ISS.</w:t>
       </w:r>
     </w:p>
     <w:p>
@@ -417,7 +481,23 @@
           <w:color w:val="222222"/>
           <w:sz w:val="20"/>
         </w:rPr>
-        <w:t>Не институциональный портфель и не VaR по книге. Это исследование одной рыночной идеи до проверяемого правила и экрана.</w:t>
+        <w:t>ТЗ на доработку алгоритма, проверка результата на истории.</w:t>
+      </w:r>
+    </w:p>
+    <w:p>
+      <w:pPr>
+        <w:pStyle w:val="ListBullet"/>
+        <w:spacing w:before="0" w:after="40" w:line="240" w:lineRule="auto"/>
+        <w:ind w:left="360"/>
+      </w:pPr>
+      <w:r>
+        <w:rPr>
+          <w:rFonts w:ascii="Arial" w:hAnsi="Arial" w:eastAsia="Arial" w:cs="Arial"/>
+          <w:b w:val="0"/>
+          <w:color w:val="222222"/>
+          <w:sz w:val="20"/>
+        </w:rPr>
+        <w:t>Исследование одной рыночной идеи до проверяемого правила и экрана.</w:t>
       </w:r>
     </w:p>
     <w:p>
@@ -436,6 +516,20 @@
     </w:p>
     <w:p>
       <w:pPr>
+        <w:spacing w:before="0" w:after="120" w:line="240" w:lineRule="auto"/>
+      </w:pPr>
+      <w:r>
+        <w:rPr>
+          <w:rFonts w:ascii="Arial" w:hAnsi="Arial" w:eastAsia="Arial" w:cs="Arial"/>
+          <w:b w:val="0"/>
+          <w:color w:val="222222"/>
+          <w:sz w:val="20"/>
+        </w:rPr>
+        <w:t>Корпоративный опыт - управленческая отчётность и аналитика, хранилища данных (контуры, витрины, архитектура, информационная безопасность, подключение BI), непрерывная поставка изменений и промышленный контур для заказчика.</w:t>
+      </w:r>
+    </w:p>
+    <w:p>
+      <w:pPr>
         <w:spacing w:before="200" w:after="0" w:line="240" w:lineRule="auto"/>
       </w:pPr>
       <w:r>
@@ -520,6 +614,20 @@
     </w:p>
     <w:p>
       <w:pPr>
+        <w:spacing w:before="80" w:after="40" w:line="240" w:lineRule="auto"/>
+      </w:pPr>
+      <w:r>
+        <w:rPr>
+          <w:rFonts w:ascii="Arial" w:hAnsi="Arial" w:eastAsia="Arial" w:cs="Arial"/>
+          <w:b/>
+          <w:color w:val="222222"/>
+          <w:sz w:val="20"/>
+        </w:rPr>
+        <w:t>Достижения и результаты:</w:t>
+      </w:r>
+    </w:p>
+    <w:p>
+      <w:pPr>
         <w:pStyle w:val="ListBullet"/>
         <w:spacing w:before="0" w:after="40" w:line="240" w:lineRule="auto"/>
         <w:ind w:left="360"/>
@@ -531,7 +639,7 @@
           <w:color w:val="222222"/>
           <w:sz w:val="20"/>
         </w:rPr>
-        <w:t>Контуры загрузки и витрины на Arenadata, согласование с архитектурой и ИБ, поставка в промышленный контур.</w:t>
+        <w:t>Создание хранилища данных на открытых технологиях: архитектура, инфраструктура, контуры загрузки, витрины; затем подключение аналитической отчётности. Выстроена непрерывная поставка изменений по контурам хранилища.</w:t>
       </w:r>
     </w:p>
     <w:p>
@@ -547,7 +655,133 @@
           <w:color w:val="222222"/>
           <w:sz w:val="20"/>
         </w:rPr>
-        <w:t>Пишу и согласовываю БТ и ТЗ, принимаю результат у разработки - тот же контур, что в вакансии с Data Science / backend.</w:t>
+        <w:t>Выстроены контуры данных и процессы согласования с архитектурой и ИБ: хранение, загрузка.</w:t>
+      </w:r>
+    </w:p>
+    <w:p>
+      <w:pPr>
+        <w:pStyle w:val="ListBullet"/>
+        <w:spacing w:before="0" w:after="40" w:line="240" w:lineRule="auto"/>
+        <w:ind w:left="360"/>
+      </w:pPr>
+      <w:r>
+        <w:rPr>
+          <w:rFonts w:ascii="Arial" w:hAnsi="Arial" w:eastAsia="Arial" w:cs="Arial"/>
+          <w:b w:val="0"/>
+          <w:color w:val="222222"/>
+          <w:sz w:val="20"/>
+        </w:rPr>
+        <w:t>Собрана и развивается кросс-функциональная команда (бизнес, ИТ, подрядчики): подбор, распределение ресурсов, координация работ.</w:t>
+      </w:r>
+    </w:p>
+    <w:p>
+      <w:pPr>
+        <w:pStyle w:val="ListBullet"/>
+        <w:spacing w:before="0" w:after="40" w:line="240" w:lineRule="auto"/>
+        <w:ind w:left="360"/>
+      </w:pPr>
+      <w:r>
+        <w:rPr>
+          <w:rFonts w:ascii="Arial" w:hAnsi="Arial" w:eastAsia="Arial" w:cs="Arial"/>
+          <w:b w:val="0"/>
+          <w:color w:val="222222"/>
+          <w:sz w:val="20"/>
+        </w:rPr>
+        <w:t>Финансы и закупки проекта; контроль бюджета, рисков и состава работ; защита статуса перед бизнесом.</w:t>
+      </w:r>
+    </w:p>
+    <w:p>
+      <w:pPr>
+        <w:pStyle w:val="ListBullet"/>
+        <w:spacing w:before="0" w:after="40" w:line="240" w:lineRule="auto"/>
+        <w:ind w:left="360"/>
+      </w:pPr>
+      <w:r>
+        <w:rPr>
+          <w:rFonts w:ascii="Arial" w:hAnsi="Arial" w:eastAsia="Arial" w:cs="Arial"/>
+          <w:b w:val="0"/>
+          <w:color w:val="222222"/>
+          <w:sz w:val="20"/>
+        </w:rPr>
+        <w:t>Согласованы ключевые документы (цели, дорожная карта, концептуальный дизайн, БТ, ТЗ) с ИТ, ИБ и бизнесом; совместно со Scrum-мастером внедрены Agile-процессы.</w:t>
+      </w:r>
+    </w:p>
+    <w:p>
+      <w:pPr>
+        <w:spacing w:before="80" w:after="40" w:line="240" w:lineRule="auto"/>
+      </w:pPr>
+      <w:r>
+        <w:rPr>
+          <w:rFonts w:ascii="Arial" w:hAnsi="Arial" w:eastAsia="Arial" w:cs="Arial"/>
+          <w:b/>
+          <w:color w:val="222222"/>
+          <w:sz w:val="20"/>
+        </w:rPr>
+        <w:t>Обязанности:</w:t>
+      </w:r>
+    </w:p>
+    <w:p>
+      <w:pPr>
+        <w:pStyle w:val="ListBullet"/>
+        <w:spacing w:before="0" w:after="40" w:line="240" w:lineRule="auto"/>
+        <w:ind w:left="360"/>
+      </w:pPr>
+      <w:r>
+        <w:rPr>
+          <w:rFonts w:ascii="Arial" w:hAnsi="Arial" w:eastAsia="Arial" w:cs="Arial"/>
+          <w:b w:val="0"/>
+          <w:color w:val="222222"/>
+          <w:sz w:val="20"/>
+        </w:rPr>
+        <w:t>Техническое руководство проектом создания хранилища данных: архитектура, инфраструктура, контуры загрузки, витрины; подключение аналитической отчётности после готовности контуров хранилища.</w:t>
+      </w:r>
+    </w:p>
+    <w:p>
+      <w:pPr>
+        <w:pStyle w:val="ListBullet"/>
+        <w:spacing w:before="0" w:after="40" w:line="240" w:lineRule="auto"/>
+        <w:ind w:left="360"/>
+      </w:pPr>
+      <w:r>
+        <w:rPr>
+          <w:rFonts w:ascii="Arial" w:hAnsi="Arial" w:eastAsia="Arial" w:cs="Arial"/>
+          <w:b w:val="0"/>
+          <w:color w:val="222222"/>
+          <w:sz w:val="20"/>
+        </w:rPr>
+        <w:t>Финансы, бюджет и закупки; планирование и контроль ресурсов.</w:t>
+      </w:r>
+    </w:p>
+    <w:p>
+      <w:pPr>
+        <w:pStyle w:val="ListBullet"/>
+        <w:spacing w:before="0" w:after="40" w:line="240" w:lineRule="auto"/>
+        <w:ind w:left="360"/>
+      </w:pPr>
+      <w:r>
+        <w:rPr>
+          <w:rFonts w:ascii="Arial" w:hAnsi="Arial" w:eastAsia="Arial" w:cs="Arial"/>
+          <w:b w:val="0"/>
+          <w:color w:val="222222"/>
+          <w:sz w:val="20"/>
+        </w:rPr>
+        <w:t>Подбор команды; взаимодействие с подрядчиками.</w:t>
+      </w:r>
+    </w:p>
+    <w:p>
+      <w:pPr>
+        <w:pStyle w:val="ListBullet"/>
+        <w:spacing w:before="0" w:after="40" w:line="240" w:lineRule="auto"/>
+        <w:ind w:left="360"/>
+      </w:pPr>
+      <w:r>
+        <w:rPr>
+          <w:rFonts w:ascii="Arial" w:hAnsi="Arial" w:eastAsia="Arial" w:cs="Arial"/>
+          <w:b w:val="0"/>
+          <w:color w:val="222222"/>
+          <w:sz w:val="20"/>
+        </w:rPr>
+        <w:t>Архитектурные решения; взаимодействие с подразделениями архитектуры и информационной безопасности.</w:t>
       </w:r>
     </w:p>
     <w:p>
@@ -619,7 +853,23 @@
           <w:color w:val="222222"/>
           <w:sz w:val="20"/>
         </w:rPr>
-        <w:t>Управленческая отчётность НЛМК на Форсайт: метрики, экраны, в части дашбордов - модели оценки и прогноза. Постановка разработке, приёмка, объяснение цифр заказчику.</w:t>
+        <w:t>Управленческая отчётность НЛМК на Форсайт: метрики, экраны, в части дашбордов - модели оценки и прогноза. Постановка разработке, приёмка.</w:t>
+      </w:r>
+    </w:p>
+    <w:p>
+      <w:pPr>
+        <w:pStyle w:val="ListBullet"/>
+        <w:spacing w:before="0" w:after="40" w:line="240" w:lineRule="auto"/>
+        <w:ind w:left="360"/>
+      </w:pPr>
+      <w:r>
+        <w:rPr>
+          <w:rFonts w:ascii="Arial" w:hAnsi="Arial" w:eastAsia="Arial" w:cs="Arial"/>
+          <w:b w:val="0"/>
+          <w:color w:val="222222"/>
+          <w:sz w:val="20"/>
+        </w:rPr>
+        <w:t>Пресейл по проектам BI и ML (более 20 проектов).</w:t>
       </w:r>
     </w:p>
     <w:p>
@@ -719,7 +969,7 @@
           <w:color w:val="222222"/>
           <w:sz w:val="20"/>
         </w:rPr>
-        <w:t>С нуля собрал методологию CSI по 70 продуктам: правило расчёта, сбор, дашборды Qlik, мониторинг, мероприятия. Это развитие методики, а не разовый отчёт.</w:t>
+        <w:t>С нуля собрал методологию CSI по 70 продуктам: правило расчёта, сбор, дашборды Qlik, мониторинг, мероприятия.</w:t>
       </w:r>
     </w:p>
     <w:p>
@@ -751,7 +1001,7 @@
           <w:color w:val="222222"/>
           <w:sz w:val="20"/>
         </w:rPr>
-        <w:t>Дашборд KPI департамента за 3 месяца при плане 6. Умею уложить статистику в слайд, который читают на комитете.</w:t>
+        <w:t>Дашборд по статусу развития программы для руководства департамента.</w:t>
       </w:r>
     </w:p>
     <w:p>
@@ -1369,7 +1619,7 @@
           <w:color w:val="222222"/>
           <w:sz w:val="21"/>
         </w:rPr>
-        <w:t>Готов на встрече разобрать, как собираю стратегию: от идеи до правила, истории и живого рынка. Новиком и TATN/TATNP - два рабочих примера. Промышленный VaR по книге готов нарастить в команде.</w:t>
+        <w:t>Готов на встрече разобрать, как собираю стратегию: от идеи до правила, истории и живого рынка.</w:t>
       </w:r>
     </w:p>
     <w:sectPr>

</xml_diff>